<commit_message>
mise à jour ; des fonctions génériques de filtrage avancés, de la documentation et des template généraux du makerBundlr .tpl
</commit_message>
<xml_diff>
--- a/docs/InBORe_documentation.docx
+++ b/docs/InBORe_documentation.docx
@@ -59,7 +59,49 @@
           <w:sz w:val="48"/>
           <w:szCs w:val="48"/>
         </w:rPr>
-        <w:t>InBORe 1.0 (Symfony 5.4LTS / PHP 8.1)</w:t>
+        <w:t>InBORe 1.</w:t>
+      </w:r>
+      <w:r>
+        <w:rPr>
+          <w:sz w:val="48"/>
+          <w:szCs w:val="48"/>
+        </w:rPr>
+        <w:t>1</w:t>
+      </w:r>
+      <w:r>
+        <w:rPr>
+          <w:sz w:val="48"/>
+          <w:szCs w:val="48"/>
+        </w:rPr>
+        <w:t xml:space="preserve"> (Symfony </w:t>
+      </w:r>
+      <w:r>
+        <w:rPr>
+          <w:sz w:val="48"/>
+          <w:szCs w:val="48"/>
+        </w:rPr>
+        <w:t>6</w:t>
+      </w:r>
+      <w:r>
+        <w:rPr>
+          <w:sz w:val="48"/>
+          <w:szCs w:val="48"/>
+        </w:rPr>
+        <w:t>.4LTS / PHP 8.</w:t>
+      </w:r>
+      <w:r>
+        <w:rPr>
+          <w:sz w:val="48"/>
+          <w:szCs w:val="48"/>
+        </w:rPr>
+        <w:t>4</w:t>
+      </w:r>
+      <w:r>
+        <w:rPr>
+          <w:sz w:val="48"/>
+          <w:szCs w:val="48"/>
+        </w:rPr>
+        <w:t>)</w:t>
       </w:r>
     </w:p>
     <w:p>
@@ -101,7 +143,7 @@
           <w:sz w:val="32"/>
           <w:szCs w:val="32"/>
         </w:rPr>
-        <w:t>20</w:t>
+        <w:t>05</w:t>
       </w:r>
       <w:r>
         <w:rPr>
@@ -115,14 +157,21 @@
           <w:sz w:val="32"/>
           <w:szCs w:val="32"/>
         </w:rPr>
-        <w:t>6</w:t>
+        <w:t>5</w:t>
       </w:r>
       <w:r>
         <w:rPr>
           <w:sz w:val="32"/>
           <w:szCs w:val="32"/>
         </w:rPr>
-        <w:t>/2023</w:t>
+        <w:t>/202</w:t>
+      </w:r>
+      <w:r>
+        <w:rPr>
+          <w:sz w:val="32"/>
+          <w:szCs w:val="32"/>
+        </w:rPr>
+        <w:t>6</w:t>
       </w:r>
     </w:p>
     <w:p>
@@ -151,7 +200,6 @@
           <w:docPartUnique/>
         </w:docPartObj>
       </w:sdtPr>
-      <w:sdtEndPr/>
       <w:sdtContent>
         <w:p>
           <w:pPr>
@@ -3205,7 +3253,14 @@
           <w:b/>
           <w:lang w:val="en-US"/>
         </w:rPr>
-        <w:t>1 ;</w:t>
+        <w:t>4</w:t>
+      </w:r>
+      <w:r>
+        <w:rPr>
+          <w:b/>
+          <w:lang w:val="en-US"/>
+        </w:rPr>
+        <w:t> ;</w:t>
       </w:r>
       <w:proofErr w:type="gramEnd"/>
       <w:r>
@@ -5822,7 +5877,22 @@
         <w:ind w:left="360"/>
       </w:pPr>
       <w:r>
-        <w:t>La procédure ajoute une table user_db à la BDD et charge une compte admin par défaut :</w:t>
+        <w:t xml:space="preserve">La procédure ajoute une table user_db à la BDD et charge une compte admin </w:t>
+      </w:r>
+      <w:r>
+        <w:t>(</w:t>
+      </w:r>
+      <w:r>
+        <w:t>ROLE_</w:t>
+      </w:r>
+      <w:r>
+        <w:t>SUPE</w:t>
+      </w:r>
+      <w:r>
+        <w:t xml:space="preserve">R_ADMIN) </w:t>
+      </w:r>
+      <w:r>
+        <w:t>par défaut :</w:t>
       </w:r>
       <w:r>
         <w:br/>
@@ -5834,11 +5904,94 @@
         <w:ind w:left="360"/>
       </w:pPr>
       <w:r>
-        <w:t xml:space="preserve">RQ ! si l’information sur les utilisateurs de l’interface (user_db) doit être enrichie par d’autres informations comme par ex. le(s) Site(s) qu’il gère, ou une information plus détaillée (table Person) il faut ajouter autant de tables relationnelles de type N-N ou 1-1 pour faire le lien vers ces tables spécifiques au projet.  Le formulaire UserType </w:t>
+        <w:t xml:space="preserve">Le compte admin a le privilège </w:t>
+      </w:r>
+      <w:r>
+        <w:t>SUPER_ADMIN</w:t>
+      </w:r>
+      <w:r>
+        <w:t xml:space="preserve"> qui lui permettra de créer et modifier des comptes ADMIN. </w:t>
+      </w:r>
+      <w:r>
+        <w:br/>
+        <w:t xml:space="preserve">Les comptes ADMIN auront le privilège de créer et modifier les comptes ; </w:t>
+      </w:r>
+      <w:r>
+        <w:t>PROJECT</w:t>
+      </w:r>
+      <w:r>
+        <w:t xml:space="preserve">, </w:t>
+      </w:r>
+      <w:r>
+        <w:t>COLLABORATION</w:t>
+      </w:r>
+      <w:r>
+        <w:t xml:space="preserve">, </w:t>
+      </w:r>
+      <w:r>
+        <w:t>INVITED</w:t>
+      </w:r>
+      <w:r>
+        <w:br/>
+      </w:r>
+      <w:r>
+        <w:t xml:space="preserve">Les comptes </w:t>
+      </w:r>
+      <w:r>
+        <w:t xml:space="preserve">ADMIN </w:t>
+      </w:r>
+      <w:r>
+        <w:t xml:space="preserve"> auront les accès CRUD sur l</w:t>
+      </w:r>
+      <w:r>
+        <w:t>’ensemble des</w:t>
+      </w:r>
+      <w:r>
+        <w:t xml:space="preserve"> données </w:t>
+      </w:r>
+      <w:r>
+        <w:br/>
       </w:r>
       <w:r>
         <w:lastRenderedPageBreak/>
-        <w:t xml:space="preserve">relatif à la table user_db sera à ajuster pour inclure les EMBED-FORM des tables à lier (par ex. </w:t>
+        <w:t>Les comptes PROJECT auront les accès CRUD sur les données qui lui seront accessible</w:t>
+      </w:r>
+      <w:r>
+        <w:br/>
+        <w:t xml:space="preserve">Les comptes COLLABORATION </w:t>
+      </w:r>
+      <w:r>
+        <w:t>auront les accès CR</w:t>
+      </w:r>
+      <w:r>
+        <w:t>ud</w:t>
+      </w:r>
+      <w:r>
+        <w:t xml:space="preserve"> sur les données de l’application qu</w:t>
+      </w:r>
+      <w:r>
+        <w:t>’il aura créé</w:t>
+      </w:r>
+      <w:r>
+        <w:br/>
+        <w:t xml:space="preserve">Les comptes </w:t>
+      </w:r>
+      <w:r>
+        <w:t>INVITED</w:t>
+      </w:r>
+      <w:r>
+        <w:t xml:space="preserve"> auront un accès Read-Only </w:t>
+      </w:r>
+      <w:r>
+        <w:t>sur les données qui lui seront accessible</w:t>
+      </w:r>
+    </w:p>
+    <w:p>
+      <w:pPr>
+        <w:ind w:left="360"/>
+      </w:pPr>
+      <w:r>
+        <w:t xml:space="preserve">RQ ! si l’information sur les utilisateurs de l’interface (user_db) doit être enrichie par d’autres informations comme par ex. le(s) Site(s) qu’il gère, ou une information plus détaillée (table Person) il faut ajouter autant de tables relationnelles de type N-N ou 1-1 pour faire le lien vers ces tables spécifiques au projet.  Le formulaire UserType relatif à la table user_db sera à ajuster pour inclure les EMBED-FORM des tables à lier (par ex. </w:t>
       </w:r>
       <w:proofErr w:type="gramStart"/>
       <w:r>
@@ -6501,6 +6654,7 @@
           <w:szCs w:val="20"/>
           <w:lang w:val="en-US"/>
         </w:rPr>
+        <w:lastRenderedPageBreak/>
         <w:t xml:space="preserve">     *  @ORM\</w:t>
       </w:r>
       <w:proofErr w:type="gramStart"/>
@@ -6597,7 +6751,6 @@
         <w:rPr>
           <w:lang w:val="en-US"/>
         </w:rPr>
-        <w:lastRenderedPageBreak/>
         <w:t xml:space="preserve">Rq – l’absence de la declaration de l’Action (ex. onDelete) au niveau de </w:t>
       </w:r>
       <w:proofErr w:type="gramStart"/>
@@ -7452,6 +7605,36 @@
       <w:r>
         <w:t>)';</w:t>
       </w:r>
+      <w:r>
+        <w:br/>
+        <w:t xml:space="preserve">    NB – ce champ est optionnel </w:t>
+      </w:r>
+      <w:r>
+        <w:t xml:space="preserve">et n’est plus utilisé par défaut depuis l’ajout des filtres avancés par colonne </w:t>
+      </w:r>
+      <w:r>
+        <w:t xml:space="preserve">(template : </w:t>
+      </w:r>
+      <w:r>
+        <w:t>index-input-filters.html</w:t>
+      </w:r>
+      <w:r>
+        <w:t>)</w:t>
+      </w:r>
+      <w:r>
+        <w:t xml:space="preserve">. Il peut cependant servir soit (i) pour un affichage standard de bootgrid (template : </w:t>
+      </w:r>
+      <w:proofErr w:type="gramStart"/>
+      <w:r>
+        <w:t>index.html.twig</w:t>
+      </w:r>
+      <w:proofErr w:type="gramEnd"/>
+      <w:r>
+        <w:t xml:space="preserve">) soi(ii) pour utiliser un filtrage via la variable url searchPattern ou </w:t>
+      </w:r>
+      <w:r>
+        <w:t>searchPhrase</w:t>
+      </w:r>
     </w:p>
     <w:p>
       <w:pPr>
@@ -8076,6 +8259,7 @@
         <w:br/>
       </w:r>
       <w:r>
+        <w:lastRenderedPageBreak/>
         <w:t>Ex2.</w:t>
       </w:r>
       <w:r>
@@ -10233,8 +10417,6 @@
           <w:szCs w:val="20"/>
         </w:rPr>
       </w:pPr>
-      <w:bookmarkStart w:id="39" w:name="_GoBack"/>
-      <w:bookmarkEnd w:id="39"/>
       <w:r>
         <w:rPr>
           <w:b/>
@@ -11267,8 +11449,8 @@
         <w:pStyle w:val="Titre2"/>
         <w:ind w:firstLine="360"/>
       </w:pPr>
-      <w:bookmarkStart w:id="40" w:name="_Toc119922936"/>
-      <w:bookmarkStart w:id="41" w:name="_Toc153206782"/>
+      <w:bookmarkStart w:id="39" w:name="_Toc119922936"/>
+      <w:bookmarkStart w:id="40" w:name="_Toc153206782"/>
       <w:r>
         <w:lastRenderedPageBreak/>
         <w:t xml:space="preserve">4c – ajuster les templates TWIG ; </w:t>
@@ -11281,8 +11463,8 @@
       <w:r>
         <w:t>,  edit.html.twig</w:t>
       </w:r>
+      <w:bookmarkEnd w:id="39"/>
       <w:bookmarkEnd w:id="40"/>
-      <w:bookmarkEnd w:id="41"/>
     </w:p>
     <w:p/>
     <w:p>
@@ -11346,9 +11528,17 @@
       <w:pPr>
         <w:pStyle w:val="Paragraphedeliste"/>
       </w:pPr>
+    </w:p>
+    <w:p>
+      <w:pPr>
+        <w:pStyle w:val="Paragraphedeliste"/>
+      </w:pPr>
       <w:r>
         <w:t>{# set the search field column to show with an asterix #}</w:t>
       </w:r>
+      <w:r>
+        <w:t xml:space="preserve"> </w:t>
+      </w:r>
     </w:p>
     <w:p>
       <w:pPr>
@@ -11405,6 +11595,24 @@
       </w:r>
       <w:r>
         <w:t>.php</w:t>
+      </w:r>
+      <w:r>
+        <w:br/>
+        <w:t>NB – ce champ n’est à afficher que si on choisit l’affichage standard de bootgrid (sans filtre /colonne) . Il faut dans ce cas changer le extends ‘</w:t>
+      </w:r>
+      <w:proofErr w:type="gramStart"/>
+      <w:r>
+        <w:t>index-input-filters.html.twig</w:t>
+      </w:r>
+      <w:proofErr w:type="gramEnd"/>
+      <w:r>
+        <w:t>’ par ‘</w:t>
+      </w:r>
+      <w:r>
+        <w:t>index.html.twig</w:t>
+      </w:r>
+      <w:r>
+        <w:t>’</w:t>
       </w:r>
     </w:p>
     <w:p>
@@ -11616,8 +11824,8 @@
         <w:pStyle w:val="Titre2"/>
         <w:ind w:firstLine="360"/>
       </w:pPr>
-      <w:bookmarkStart w:id="42" w:name="_Toc119922937"/>
-      <w:bookmarkStart w:id="43" w:name="_Toc153206783"/>
+      <w:bookmarkStart w:id="41" w:name="_Toc119922937"/>
+      <w:bookmarkStart w:id="42" w:name="_Toc153206783"/>
       <w:r>
         <w:t xml:space="preserve">4d – ajuster les versions bilingues des ; </w:t>
       </w:r>
@@ -11629,8 +11837,8 @@
       <w:r>
         <w:t xml:space="preserve"> libellés et mentions légales</w:t>
       </w:r>
+      <w:bookmarkEnd w:id="41"/>
       <w:bookmarkEnd w:id="42"/>
-      <w:bookmarkEnd w:id="43"/>
     </w:p>
     <w:p>
       <w:pPr>
@@ -11758,17 +11966,12 @@
     </w:p>
     <w:p/>
     <w:p>
-      <w:r>
-        <w:br w:type="page"/>
-      </w:r>
-    </w:p>
-    <w:p>
       <w:pPr>
         <w:pStyle w:val="Titre1"/>
         <w:ind w:firstLine="360"/>
       </w:pPr>
-      <w:bookmarkStart w:id="44" w:name="_Toc119922938"/>
-      <w:bookmarkStart w:id="45" w:name="_Toc153206784"/>
+      <w:bookmarkStart w:id="43" w:name="_Toc119922938"/>
+      <w:bookmarkStart w:id="44" w:name="_Toc153206784"/>
       <w:r>
         <w:lastRenderedPageBreak/>
         <w:t xml:space="preserve">5 </w:t>
@@ -11781,8 +11984,8 @@
       <w:r>
         <w:t>/Evolutions des entités &amp; formulaires</w:t>
       </w:r>
+      <w:bookmarkEnd w:id="43"/>
       <w:bookmarkEnd w:id="44"/>
-      <w:bookmarkEnd w:id="45"/>
     </w:p>
     <w:p>
       <w:pPr>
@@ -11794,13 +11997,13 @@
         <w:pStyle w:val="Titre2"/>
         <w:ind w:firstLine="360"/>
       </w:pPr>
-      <w:bookmarkStart w:id="46" w:name="_Toc119922939"/>
-      <w:bookmarkStart w:id="47" w:name="_Toc153206785"/>
+      <w:bookmarkStart w:id="45" w:name="_Toc119922939"/>
+      <w:bookmarkStart w:id="46" w:name="_Toc153206785"/>
       <w:r>
         <w:t>5a – Ajout d’une Collection (relation 1-N ou N-N)</w:t>
       </w:r>
+      <w:bookmarkEnd w:id="45"/>
       <w:bookmarkEnd w:id="46"/>
-      <w:bookmarkEnd w:id="47"/>
     </w:p>
     <w:p>
       <w:pPr>
@@ -12872,13 +13075,13 @@
         <w:pStyle w:val="Titre2"/>
         <w:ind w:firstLine="360"/>
       </w:pPr>
-      <w:bookmarkStart w:id="48" w:name="_Toc119922940"/>
-      <w:bookmarkStart w:id="49" w:name="_Toc153206786"/>
+      <w:bookmarkStart w:id="47" w:name="_Toc119922940"/>
+      <w:bookmarkStart w:id="48" w:name="_Toc153206786"/>
       <w:r>
         <w:t>5b – Ajout d’un attribut et MAJ du schéma de bdd</w:t>
       </w:r>
+      <w:bookmarkEnd w:id="47"/>
       <w:bookmarkEnd w:id="48"/>
-      <w:bookmarkEnd w:id="49"/>
     </w:p>
     <w:p>
       <w:pPr>
@@ -13322,8 +13525,8 @@
         </w:rPr>
         <w:t xml:space="preserve"> --regenerate App\Entity\NomEntiteAModifier</w:t>
       </w:r>
-      <w:bookmarkStart w:id="50" w:name="_Hlk117522008"/>
-      <w:bookmarkEnd w:id="50"/>
+      <w:bookmarkStart w:id="49" w:name="_Hlk117522008"/>
+      <w:bookmarkEnd w:id="49"/>
     </w:p>
     <w:p>
       <w:pPr>
@@ -13380,13 +13583,13 @@
         <w:pStyle w:val="Titre2"/>
         <w:ind w:firstLine="360"/>
       </w:pPr>
-      <w:bookmarkStart w:id="51" w:name="_Toc119922941"/>
-      <w:bookmarkStart w:id="52" w:name="_Toc153206787"/>
+      <w:bookmarkStart w:id="50" w:name="_Toc119922941"/>
+      <w:bookmarkStart w:id="51" w:name="_Toc153206787"/>
       <w:r>
         <w:t>5c – Ajout contrainte UNIQUE et MAJ du schéma de bdd</w:t>
       </w:r>
+      <w:bookmarkEnd w:id="50"/>
       <w:bookmarkEnd w:id="51"/>
-      <w:bookmarkEnd w:id="52"/>
     </w:p>
     <w:p>
       <w:pPr>
@@ -13643,8 +13846,8 @@
         </w:rPr>
         <w:t>:migrate</w:t>
       </w:r>
-      <w:bookmarkStart w:id="53" w:name="_Hlk117587429"/>
-      <w:bookmarkEnd w:id="53"/>
+      <w:bookmarkStart w:id="52" w:name="_Hlk117587429"/>
+      <w:bookmarkEnd w:id="52"/>
     </w:p>
     <w:p/>
     <w:p>
@@ -13666,14 +13869,14 @@
       <w:pPr>
         <w:pStyle w:val="Titre1"/>
       </w:pPr>
-      <w:bookmarkStart w:id="54" w:name="_Toc119922942"/>
-      <w:bookmarkStart w:id="55" w:name="_Toc153206788"/>
+      <w:bookmarkStart w:id="53" w:name="_Toc119922942"/>
+      <w:bookmarkStart w:id="54" w:name="_Toc153206788"/>
       <w:r>
         <w:lastRenderedPageBreak/>
         <w:t>6– Gestion centralisée des assets (js, css) avec Encore</w:t>
       </w:r>
+      <w:bookmarkEnd w:id="53"/>
       <w:bookmarkEnd w:id="54"/>
-      <w:bookmarkEnd w:id="55"/>
       <w:r>
         <w:t xml:space="preserve"> </w:t>
       </w:r>
@@ -13761,8 +13964,8 @@
       <w:pPr>
         <w:pStyle w:val="Titre2"/>
       </w:pPr>
-      <w:bookmarkStart w:id="56" w:name="_Toc119922943"/>
-      <w:bookmarkStart w:id="57" w:name="_Toc153206789"/>
+      <w:bookmarkStart w:id="55" w:name="_Toc119922943"/>
+      <w:bookmarkStart w:id="56" w:name="_Toc153206789"/>
       <w:r>
         <w:t xml:space="preserve">6a- </w:t>
       </w:r>
@@ -13774,8 +13977,8 @@
       <w:r>
         <w:t xml:space="preserve"> WebpackEncoreBundle</w:t>
       </w:r>
+      <w:bookmarkEnd w:id="55"/>
       <w:bookmarkEnd w:id="56"/>
-      <w:bookmarkEnd w:id="57"/>
       <w:r>
         <w:t xml:space="preserve"> </w:t>
       </w:r>
@@ -14768,13 +14971,13 @@
       <w:pPr>
         <w:pStyle w:val="Titre2"/>
       </w:pPr>
-      <w:bookmarkStart w:id="58" w:name="_Toc119922944"/>
-      <w:bookmarkStart w:id="59" w:name="_Toc153206790"/>
+      <w:bookmarkStart w:id="57" w:name="_Toc119922944"/>
+      <w:bookmarkStart w:id="58" w:name="_Toc153206790"/>
       <w:r>
         <w:t>6b- Ajout de modules Javascript</w:t>
       </w:r>
+      <w:bookmarkEnd w:id="57"/>
       <w:bookmarkEnd w:id="58"/>
-      <w:bookmarkEnd w:id="59"/>
       <w:r>
         <w:t xml:space="preserve"> </w:t>
       </w:r>
@@ -14909,7 +15112,7 @@
       <w:pPr>
         <w:pStyle w:val="Titre2"/>
       </w:pPr>
-      <w:bookmarkStart w:id="60" w:name="_Toc153206791"/>
+      <w:bookmarkStart w:id="59" w:name="_Toc153206791"/>
       <w:r>
         <w:lastRenderedPageBreak/>
         <w:t>6c</w:t>
@@ -14923,7 +15126,7 @@
       <w:r>
         <w:t xml:space="preserve"> js</w:t>
       </w:r>
-      <w:bookmarkEnd w:id="60"/>
+      <w:bookmarkEnd w:id="59"/>
       <w:r>
         <w:t xml:space="preserve"> </w:t>
       </w:r>
@@ -15052,14 +15255,14 @@
       <w:pPr>
         <w:pStyle w:val="Titre1"/>
       </w:pPr>
-      <w:bookmarkStart w:id="61" w:name="_Toc119922945"/>
-      <w:bookmarkStart w:id="62" w:name="_Toc153206792"/>
+      <w:bookmarkStart w:id="60" w:name="_Toc119922945"/>
+      <w:bookmarkStart w:id="61" w:name="_Toc153206792"/>
       <w:r>
         <w:lastRenderedPageBreak/>
         <w:t>7 – Bundle Symfony – Usage &amp; Déploiement</w:t>
       </w:r>
+      <w:bookmarkEnd w:id="60"/>
       <w:bookmarkEnd w:id="61"/>
-      <w:bookmarkEnd w:id="62"/>
       <w:r>
         <w:t xml:space="preserve">   </w:t>
       </w:r>
@@ -15078,13 +15281,13 @@
         <w:pStyle w:val="Titre2"/>
         <w:ind w:left="360"/>
       </w:pPr>
-      <w:bookmarkStart w:id="63" w:name="_Toc119922946"/>
-      <w:bookmarkStart w:id="64" w:name="_Toc153206793"/>
+      <w:bookmarkStart w:id="62" w:name="_Toc119922946"/>
+      <w:bookmarkStart w:id="63" w:name="_Toc153206793"/>
       <w:r>
         <w:t>7a – Info sur le bundle FOSJSRoutingBundle 2.x</w:t>
       </w:r>
+      <w:bookmarkEnd w:id="62"/>
       <w:bookmarkEnd w:id="63"/>
-      <w:bookmarkEnd w:id="64"/>
     </w:p>
     <w:p>
       <w:pPr>
@@ -15294,38 +15497,38 @@
       <w:pPr>
         <w:pStyle w:val="Titre1"/>
       </w:pPr>
-      <w:bookmarkStart w:id="65" w:name="_Toc119922947"/>
-      <w:bookmarkStart w:id="66" w:name="_Toc153206794"/>
+      <w:bookmarkStart w:id="64" w:name="_Toc119922947"/>
+      <w:bookmarkStart w:id="65" w:name="_Toc153206794"/>
       <w:r>
         <w:lastRenderedPageBreak/>
         <w:t>8 – Extension du projet InBORe : Services – Usage &amp; Description</w:t>
       </w:r>
+      <w:bookmarkEnd w:id="64"/>
       <w:bookmarkEnd w:id="65"/>
+      <w:r>
+        <w:t xml:space="preserve">   </w:t>
+      </w:r>
+    </w:p>
+    <w:p/>
+    <w:p>
+      <w:pPr>
+        <w:ind w:left="426"/>
+      </w:pPr>
+      <w:r>
+        <w:t>Ajout de nouveaux services dans le projet InBORe</w:t>
+      </w:r>
+    </w:p>
+    <w:p>
+      <w:pPr>
+        <w:pStyle w:val="Titre2"/>
+      </w:pPr>
+      <w:bookmarkStart w:id="66" w:name="_Toc119922948"/>
+      <w:bookmarkStart w:id="67" w:name="_Toc153206795"/>
+      <w:r>
+        <w:t>8a – Service FileLoader</w:t>
+      </w:r>
       <w:bookmarkEnd w:id="66"/>
-      <w:r>
-        <w:t xml:space="preserve">   </w:t>
-      </w:r>
-    </w:p>
-    <w:p/>
-    <w:p>
-      <w:pPr>
-        <w:ind w:left="426"/>
-      </w:pPr>
-      <w:r>
-        <w:t>Ajout de nouveaux services dans le projet InBORe</w:t>
-      </w:r>
-    </w:p>
-    <w:p>
-      <w:pPr>
-        <w:pStyle w:val="Titre2"/>
-      </w:pPr>
-      <w:bookmarkStart w:id="67" w:name="_Toc119922948"/>
-      <w:bookmarkStart w:id="68" w:name="_Toc153206795"/>
-      <w:r>
-        <w:t>8a – Service FileLoader</w:t>
-      </w:r>
       <w:bookmarkEnd w:id="67"/>
-      <w:bookmarkEnd w:id="68"/>
     </w:p>
     <w:p>
       <w:pPr>
@@ -17233,11 +17436,11 @@
       <w:pPr>
         <w:pStyle w:val="Titre1"/>
       </w:pPr>
-      <w:bookmarkStart w:id="69" w:name="_Toc153206796"/>
+      <w:bookmarkStart w:id="68" w:name="_Toc153206796"/>
       <w:r>
         <w:t>Annexe 1 – Architecture logicielle – InBORe</w:t>
       </w:r>
-      <w:bookmarkEnd w:id="69"/>
+      <w:bookmarkEnd w:id="68"/>
     </w:p>
     <w:p>
       <w:pPr>
@@ -19402,6 +19605,8 @@
             <w:r>
               <w:t>security.yaml</w:t>
             </w:r>
+            <w:bookmarkStart w:id="69" w:name="_GoBack"/>
+            <w:bookmarkEnd w:id="69"/>
             <w:proofErr w:type="gramEnd"/>
           </w:p>
         </w:tc>
@@ -19423,7 +19628,7 @@
             </w:r>
             <w:proofErr w:type="gramEnd"/>
             <w:r>
-              <w:t xml:space="preserve"> de la sécurité , des rôles , de la npage de login et d’accès, des firewalls …</w:t>
+              <w:t xml:space="preserve"> de la sécurité , des rôles , de la page de login et d’accès, des firewalls …</w:t>
             </w:r>
           </w:p>
         </w:tc>
@@ -19673,7 +19878,6 @@
           </w:tcPr>
           <w:p>
             <w:r>
-              <w:lastRenderedPageBreak/>
               <w:t>/src/Controller</w:t>
             </w:r>
           </w:p>
@@ -27071,7 +27275,7 @@
 </file>
 
 <file path=customXml/itemProps1.xml><?xml version="1.0" encoding="utf-8"?>
-<ds:datastoreItem xmlns:ds="http://schemas.openxmlformats.org/officeDocument/2006/customXml" ds:itemID="{D509D089-B357-49DC-A290-18675AC5DB9C}">
+<ds:datastoreItem xmlns:ds="http://schemas.openxmlformats.org/officeDocument/2006/customXml" ds:itemID="{96DBE467-E465-4556-A50A-AF306AC5B069}">
   <ds:schemaRefs>
     <ds:schemaRef ds:uri="http://schemas.openxmlformats.org/officeDocument/2006/bibliography"/>
   </ds:schemaRefs>

</xml_diff>